<commit_message>
Add participant material online and simplify handout
</commit_message>
<xml_diff>
--- a/Materiale partecipanti - ItalBridge Transport.docx
+++ b/Materiale partecipanti - ItalBridge Transport.docx
@@ -142,7 +142,7 @@
         <w:pStyle w:val="Heading1"/>
       </w:pPr>
       <w:r>
-        <w:t>Come usarla</w:t>
+        <w:t>Uso rapido</w:t>
       </w:r>
     </w:p>
     <w:p>
@@ -150,7 +150,7 @@
         <w:pStyle w:val="ListBullet"/>
       </w:pPr>
       <w:r>
-        <w:t>Leggete lo scenario iniziale e annotate i vincoli che ritenete più rilevanti.</w:t>
+        <w:t>Annotate solo ciò che vi aiuta a chiarire la scelta.</w:t>
       </w:r>
     </w:p>
     <w:p>
@@ -158,7 +158,7 @@
         <w:pStyle w:val="ListBullet"/>
       </w:pPr>
       <w:r>
-        <w:t>Per ogni round discutete prima il perché della scelta e solo dopo fissate l’opzione da comunicare al facilitatore.</w:t>
+        <w:t>Per ogni round fissate prima la priorità che volete proteggere.</w:t>
       </w:r>
     </w:p>
     <w:p>
@@ -166,15 +166,7 @@
         <w:pStyle w:val="ListBullet"/>
       </w:pPr>
       <w:r>
-        <w:t>Usate le righe sul costo atteso per esplicitare che cosa siete disposti a sacrificare.</w:t>
-      </w:r>
-    </w:p>
-    <w:p>
-      <w:pPr>
-        <w:pStyle w:val="ListBullet"/>
-      </w:pPr>
-      <w:r>
-        <w:t>Nel debrief finale confrontate il percorso fatto con il mandato della vostra squadra.</w:t>
+        <w:t>Segnate il prezzo che siete disposti a pagare per quella linea.</w:t>
       </w:r>
     </w:p>
     <w:p>
@@ -309,28 +301,7 @@
           </w:tcPr>
           <w:p>
             <w:r>
-              <w:t>Quale costo o rischio si aspetta</w:t>
-            </w:r>
-          </w:p>
-        </w:tc>
-        <w:tc>
-          <w:tcPr>
-            <w:tcW w:type="dxa" w:w="5112"/>
-          </w:tcPr>
-          <w:p>
-            <w:r/>
-          </w:p>
-        </w:tc>
-      </w:tr>
-      <w:tr>
-        <w:tc>
-          <w:tcPr>
-            <w:tcW w:type="dxa" w:w="5112"/>
-            <w:shd w:fill="EEF3F8"/>
-          </w:tcPr>
-          <w:p>
-            <w:r>
-              <w:t>Segnali da osservare a fine round</w:t>
+              <w:t>Quale prezzo siete disposti a pagare</w:t>
             </w:r>
           </w:p>
         </w:tc>
@@ -477,28 +448,7 @@
           </w:tcPr>
           <w:p>
             <w:r>
-              <w:t>Quale costo o rischio si aspetta</w:t>
-            </w:r>
-          </w:p>
-        </w:tc>
-        <w:tc>
-          <w:tcPr>
-            <w:tcW w:type="dxa" w:w="5112"/>
-          </w:tcPr>
-          <w:p>
-            <w:r/>
-          </w:p>
-        </w:tc>
-      </w:tr>
-      <w:tr>
-        <w:tc>
-          <w:tcPr>
-            <w:tcW w:type="dxa" w:w="5112"/>
-            <w:shd w:fill="EEF3F8"/>
-          </w:tcPr>
-          <w:p>
-            <w:r>
-              <w:t>Segnali da osservare a fine round</w:t>
+              <w:t>Quale prezzo siete disposti a pagare</w:t>
             </w:r>
           </w:p>
         </w:tc>
@@ -645,28 +595,7 @@
           </w:tcPr>
           <w:p>
             <w:r>
-              <w:t>Quale costo o rischio si aspetta</w:t>
-            </w:r>
-          </w:p>
-        </w:tc>
-        <w:tc>
-          <w:tcPr>
-            <w:tcW w:type="dxa" w:w="5112"/>
-          </w:tcPr>
-          <w:p>
-            <w:r/>
-          </w:p>
-        </w:tc>
-      </w:tr>
-      <w:tr>
-        <w:tc>
-          <w:tcPr>
-            <w:tcW w:type="dxa" w:w="5112"/>
-            <w:shd w:fill="EEF3F8"/>
-          </w:tcPr>
-          <w:p>
-            <w:r>
-              <w:t>Segnali da osservare a fine round</w:t>
+              <w:t>Quale prezzo siete disposti a pagare</w:t>
             </w:r>
           </w:p>
         </w:tc>
@@ -686,7 +615,7 @@
         <w:pStyle w:val="Heading1"/>
       </w:pPr>
       <w:r>
-        <w:t>Domande utili per il debrief</w:t>
+        <w:t>Debrief finale</w:t>
       </w:r>
     </w:p>
     <w:p>
@@ -710,15 +639,7 @@
         <w:pStyle w:val="ListBullet"/>
       </w:pPr>
       <w:r>
-        <w:t>In quale momento il team ha perso o guadagnato robustezza?</w:t>
-      </w:r>
-    </w:p>
-    <w:p>
-      <w:pPr>
-        <w:pStyle w:val="ListBullet"/>
-      </w:pPr>
-      <w:r>
-        <w:t>Se l’anno continuasse, da quale punto forte o fragile ripartiremmo?</w:t>
+        <w:t>Da quale punto forte o fragile ripartiremmo se l’anno continuasse?</w:t>
       </w:r>
     </w:p>
     <w:sectPr>

</xml_diff>

<commit_message>
Expand participant material with cover and intro
</commit_message>
<xml_diff>
--- a/Materiale partecipanti - ItalBridge Transport.docx
+++ b/Materiale partecipanti - ItalBridge Transport.docx
@@ -2,6 +2,103 @@
 <file path=word/document.xml><?xml version="1.0" encoding="utf-8"?>
 <w:document xmlns:wpc="http://schemas.microsoft.com/office/word/2010/wordprocessingCanvas" xmlns:mo="http://schemas.microsoft.com/office/mac/office/2008/main" xmlns:mc="http://schemas.openxmlformats.org/markup-compatibility/2006" xmlns:mv="urn:schemas-microsoft-com:mac:vml" xmlns:o="urn:schemas-microsoft-com:office:office" xmlns:r="http://schemas.openxmlformats.org/officeDocument/2006/relationships" xmlns:m="http://schemas.openxmlformats.org/officeDocument/2006/math" xmlns:v="urn:schemas-microsoft-com:vml" xmlns:wp14="http://schemas.microsoft.com/office/word/2010/wordprocessingDrawing" xmlns:wp="http://schemas.openxmlformats.org/drawingml/2006/wordprocessingDrawing" xmlns:w10="urn:schemas-microsoft-com:office:word" xmlns:w="http://schemas.openxmlformats.org/wordprocessingml/2006/main" xmlns:w14="http://schemas.microsoft.com/office/word/2010/wordml" xmlns:wpg="http://schemas.microsoft.com/office/word/2010/wordprocessingGroup" xmlns:wpi="http://schemas.microsoft.com/office/word/2010/wordprocessingInk" xmlns:wne="http://schemas.microsoft.com/office/word/2006/wordml" xmlns:wps="http://schemas.microsoft.com/office/word/2010/wordprocessingShape" mc:Ignorable="w14 wp14">
   <w:body>
+    <w:p>
+      <w:pPr>
+        <w:jc w:val="center"/>
+      </w:pPr>
+      <w:r>
+        <w:rPr>
+          <w:b/>
+          <w:color w:val="556171"/>
+          <w:sz w:val="20"/>
+        </w:rPr>
+        <w:t>ITALBRIDGE TRANSPORT</w:t>
+      </w:r>
+    </w:p>
+    <w:p>
+      <w:pPr>
+        <w:jc w:val="center"/>
+      </w:pPr>
+      <w:r>
+        <w:rPr>
+          <w:rFonts w:ascii="Aptos Display" w:hAnsi="Aptos Display"/>
+          <w:b/>
+          <w:color w:val="2D4766"/>
+          <w:sz w:val="56"/>
+        </w:rPr>
+        <w:t>Materiale partecipanti</w:t>
+      </w:r>
+    </w:p>
+    <w:p>
+      <w:pPr>
+        <w:jc w:val="center"/>
+      </w:pPr>
+      <w:r>
+        <w:rPr>
+          <w:color w:val="121924"/>
+          <w:sz w:val="24"/>
+        </w:rPr>
+        <w:t>Business game executive | Trasporti e logistica</w:t>
+      </w:r>
+    </w:p>
+    <w:p/>
+    <w:p>
+      <w:pPr>
+        <w:jc w:val="center"/>
+      </w:pPr>
+      <w:r>
+        <w:drawing>
+          <wp:inline xmlns:a="http://schemas.openxmlformats.org/drawingml/2006/main" xmlns:pic="http://schemas.openxmlformats.org/drawingml/2006/picture">
+            <wp:extent cx="5760720" cy="3840480"/>
+            <wp:docPr id="1" name="Picture 1"/>
+            <wp:cNvGraphicFramePr>
+              <a:graphicFrameLocks noChangeAspect="1"/>
+            </wp:cNvGraphicFramePr>
+            <a:graphic>
+              <a:graphicData uri="http://schemas.openxmlformats.org/drawingml/2006/picture">
+                <pic:pic>
+                  <pic:nvPicPr>
+                    <pic:cNvPr id="0" name="benvenuto.png"/>
+                    <pic:cNvPicPr/>
+                  </pic:nvPicPr>
+                  <pic:blipFill>
+                    <a:blip r:embed="rId9"/>
+                    <a:stretch>
+                      <a:fillRect/>
+                    </a:stretch>
+                  </pic:blipFill>
+                  <pic:spPr>
+                    <a:xfrm>
+                      <a:off x="0" y="0"/>
+                      <a:ext cx="5760720" cy="3840480"/>
+                    </a:xfrm>
+                    <a:prstGeom prst="rect"/>
+                  </pic:spPr>
+                </pic:pic>
+              </a:graphicData>
+            </a:graphic>
+          </wp:inline>
+        </w:drawing>
+      </w:r>
+    </w:p>
+    <w:p>
+      <w:pPr>
+        <w:jc w:val="center"/>
+      </w:pPr>
+      <w:r>
+        <w:rPr>
+          <w:b/>
+          <w:color w:val="2D4766"/>
+          <w:sz w:val="22"/>
+        </w:rPr>
+        <w:t>4 squadre  |  3 round  |  60 minuti  |  1 anno simulato</w:t>
+      </w:r>
+    </w:p>
+    <w:p>
+      <w:r>
+        <w:br w:type="page"/>
+      </w:r>
+    </w:p>
     <w:p>
       <w:pPr>
         <w:spacing w:after="40"/>
@@ -137,6 +234,102 @@
       </w:tr>
     </w:tbl>
     <w:p/>
+    <w:p>
+      <w:pPr>
+        <w:pStyle w:val="Heading1"/>
+      </w:pPr>
+      <w:r>
+        <w:t>Il business game</w:t>
+      </w:r>
+    </w:p>
+    <w:p>
+      <w:pPr>
+        <w:pStyle w:val="ListBullet"/>
+      </w:pPr>
+      <w:r>
+        <w:t>La simulazione riproduce un anno di decisioni in un operatore integrato di trasporti e logistica.</w:t>
+      </w:r>
+    </w:p>
+    <w:p>
+      <w:pPr>
+        <w:pStyle w:val="ListBullet"/>
+      </w:pPr>
+      <w:r>
+        <w:t>Ogni squadra parte dallo stesso scenario iniziale, ma affronta il percorso con un mandato riservato assegnato dal facilitatore.</w:t>
+      </w:r>
+    </w:p>
+    <w:p>
+      <w:pPr>
+        <w:pStyle w:val="ListBullet"/>
+      </w:pPr>
+      <w:r>
+        <w:t>In ogni round il team prende una decisione strategica, una decisione operativa e una decisione sul coinvolgimento interno del management.</w:t>
+      </w:r>
+    </w:p>
+    <w:p>
+      <w:pPr>
+        <w:pStyle w:val="Heading1"/>
+      </w:pPr>
+      <w:r>
+        <w:t>Scenario di partenza</w:t>
+      </w:r>
+    </w:p>
+    <w:p>
+      <w:pPr>
+        <w:pStyle w:val="ListBullet"/>
+      </w:pPr>
+      <w:r>
+        <w:t>ItalBridge Transport parte con ricavi solidi, ma con marginalità contenuta, cassa sotto pressione e struttura operativa già molto tesa.</w:t>
+      </w:r>
+    </w:p>
+    <w:p>
+      <w:pPr>
+        <w:pStyle w:val="ListBullet"/>
+      </w:pPr>
+      <w:r>
+        <w:t>Il mercato resta competitivo, con clienti rilevanti, richieste di flessibilità e costi esterni instabili.</w:t>
+      </w:r>
+    </w:p>
+    <w:p>
+      <w:pPr>
+        <w:pStyle w:val="ListBullet"/>
+      </w:pPr>
+      <w:r>
+        <w:t>Durante il game possono entrare eventi straordinari interni ed esterni che modificano priorità, tempi e qualità della risposta manageriale.</w:t>
+      </w:r>
+    </w:p>
+    <w:p>
+      <w:pPr>
+        <w:pStyle w:val="Heading1"/>
+      </w:pPr>
+      <w:r>
+        <w:t>Regole del gioco</w:t>
+      </w:r>
+    </w:p>
+    <w:p>
+      <w:pPr>
+        <w:pStyle w:val="ListBullet"/>
+      </w:pPr>
+      <w:r>
+        <w:t>Discutete nel team e comunicate al facilitatore una scelta per ciascun blocco del round.</w:t>
+      </w:r>
+    </w:p>
+    <w:p>
+      <w:pPr>
+        <w:pStyle w:val="ListBullet"/>
+      </w:pPr>
+      <w:r>
+        <w:t>Non esiste una scelta perfetta in assoluto: conta la coerenza tra priorità protetta, costo pagato e robustezza della traiettoria.</w:t>
+      </w:r>
+    </w:p>
+    <w:p>
+      <w:pPr>
+        <w:pStyle w:val="ListBullet"/>
+      </w:pPr>
+      <w:r>
+        <w:t>Usate questa scheda solo come supporto di lavoro: annotate ciò che vi aiuta davvero a decidere e a leggere il debrief finale.</w:t>
+      </w:r>
+    </w:p>
     <w:p>
       <w:pPr>
         <w:pStyle w:val="Heading1"/>

</xml_diff>